<commit_message>
Remove false multi-model claim from Advisor header
The header claimed a Claude + ChatGPT + Gemini engine, URL verification
and citation enforcement, none of which exist. It now tells users to check
important details with official sources.

Remove the matching known-gap entries from the PRD.

Co-Authored-By: Claude Opus 5.5 <noreply@anthropic.com>
</commit_message>
<xml_diff>
--- a/Home-Compass-PRD.docx
+++ b/Home-Compass-PRD.docx
@@ -2035,40 +2035,6 @@
     </w:p>
     <w:p>
       <w:pPr>
-        <w:rPr>
-          <w:rFonts w:ascii="Times New Roman" w:hAnsi="Times New Roman" w:cs="Times New Roman"/>
-        </w:rPr>
-      </w:pPr>
-      <w:r>
-        <w:rPr>
-          <w:rFonts w:ascii="Times New Roman" w:hAnsi="Times New Roman" w:cs="Times New Roman"/>
-          <w:i/>
-          <w:color w:val="4F81BD" w:themeColor="accent1"/>
-          <w:sz w:val="20"/>
-        </w:rPr>
-        <w:t xml:space="preserve">Known gap: the Advisor's header currently reads "Multi-model engine (Claude + ChatGPT + </w:t>
-      </w:r>
-      <w:r>
-        <w:rPr>
-          <w:rFonts w:ascii="Times New Roman" w:hAnsi="Times New Roman" w:cs="Times New Roman"/>
-          <w:i/>
-          <w:color w:val="4F81BD" w:themeColor="accent1"/>
-          <w:sz w:val="20"/>
-        </w:rPr>
-        <w:t xml:space="preserve">Gemini) · URL-verified</w:t>
-      </w:r>
-      <w:r>
-        <w:rPr>
-          <w:rFonts w:ascii="Times New Roman" w:hAnsi="Times New Roman" w:cs="Times New Roman"/>
-          <w:i/>
-          <w:color w:val="4F81BD" w:themeColor="accent1"/>
-          <w:sz w:val="20"/>
-        </w:rPr>
-        <w:t xml:space="preserve"> · Citation enforced" — none of that is true of the current single-provider implementation.</w:t>
-      </w:r>
-    </w:p>
-    <w:p>
-      <w:pPr>
         <w:pStyle w:val="Heading1"/>
         <w:rPr>
           <w:rFonts w:ascii="Times New Roman" w:hAnsi="Times New Roman" w:cs="Times New Roman"/>
@@ -3288,48 +3254,6 @@
         </w:rPr>
         <w:lastRenderedPageBreak/>
         <w:t>11. Known Gaps and Risks</w:t>
-      </w:r>
-    </w:p>
-    <w:p>
-      <w:pPr>
-        <w:pStyle w:val="ListBullet"/>
-        <w:tabs>
-          <w:tab w:val="clear" w:pos="360"/>
-          <w:tab w:val="num" w:pos="437"/>
-        </w:tabs>
-        <w:rPr>
-          <w:rFonts w:ascii="Times New Roman" w:hAnsi="Times New Roman" w:cs="Times New Roman"/>
-        </w:rPr>
-      </w:pPr>
-      <w:r>
-        <w:rPr>
-          <w:rFonts w:ascii="Times New Roman" w:hAnsi="Times New Roman" w:cs="Times New Roman"/>
-        </w:rPr>
-        <w:t xml:space="preserve">The Advisor header makes the system sound more advanced than it actually is. It claims the system uses multiple AI models, verifies URLs, and enforces citations, but </w:t>
-      </w:r>
-      <w:r>
-        <w:rPr>
-          <w:rFonts w:ascii="Times New Roman" w:hAnsi="Times New Roman" w:cs="Times New Roman"/>
-          <w:b/>
-          <w:bCs/>
-        </w:rPr>
-        <w:t xml:space="preserve">those features are not currently implemented in the </w:t>
-      </w:r>
-      <w:r>
-        <w:rPr>
-          <w:rFonts w:ascii="Times New Roman" w:hAnsi="Times New Roman" w:cs="Times New Roman"/>
-          <w:b/>
-          <w:bCs/>
-        </w:rPr>
-        <w:t>code.</w:t>
-      </w:r>
-      <w:r>
-        <w:rPr>
-          <w:rFonts w:ascii="Times New Roman" w:hAnsi="Times New Roman" w:cs="Times New Roman"/>
-          <w:b/>
-          <w:bCs/>
-        </w:rPr>
-        <w:t xml:space="preserve"> </w:t>
       </w:r>
     </w:p>
     <w:p>

</xml_diff>